<commit_message>
Using local parameters and adding extra operations
</commit_message>
<xml_diff>
--- a/ALU/תמונות לALU.docx
+++ b/ALU/תמונות לALU.docx
@@ -14,26 +14,26 @@
           <w:rtl/>
         </w:rPr>
         <w:drawing>
-          <wp:anchor distT="0" distB="0" distL="114300" distR="114300" simplePos="0" relativeHeight="251658240" behindDoc="1" locked="0" layoutInCell="1" allowOverlap="1" wp14:anchorId="043A1972" wp14:editId="4FD75A22">
+          <wp:anchor distT="0" distB="0" distL="114300" distR="114300" simplePos="0" relativeHeight="251658240" behindDoc="1" locked="0" layoutInCell="1" allowOverlap="1" wp14:anchorId="6ADE3525" wp14:editId="2680E2F4">
             <wp:simplePos x="0" y="0"/>
             <wp:positionH relativeFrom="page">
-              <wp:posOffset>-201295</wp:posOffset>
+              <wp:posOffset>-79375</wp:posOffset>
             </wp:positionH>
             <wp:positionV relativeFrom="paragraph">
-              <wp:posOffset>274320</wp:posOffset>
+              <wp:posOffset>228600</wp:posOffset>
             </wp:positionV>
-            <wp:extent cx="7761605" cy="693420"/>
-            <wp:effectExtent l="0" t="0" r="0" b="0"/>
+            <wp:extent cx="7639685" cy="830580"/>
+            <wp:effectExtent l="0" t="0" r="0" b="7620"/>
             <wp:wrapTight wrapText="bothSides">
               <wp:wrapPolygon edited="0">
                 <wp:start x="0" y="0"/>
-                <wp:lineTo x="0" y="20769"/>
-                <wp:lineTo x="21524" y="20769"/>
-                <wp:lineTo x="21524" y="0"/>
+                <wp:lineTo x="0" y="21303"/>
+                <wp:lineTo x="21544" y="21303"/>
+                <wp:lineTo x="21544" y="0"/>
                 <wp:lineTo x="0" y="0"/>
               </wp:wrapPolygon>
             </wp:wrapTight>
-            <wp:docPr id="1336374092" name="תמונה 1"/>
+            <wp:docPr id="1966470041" name="תמונה 1"/>
             <wp:cNvGraphicFramePr>
               <a:graphicFrameLocks xmlns:a="http://schemas.openxmlformats.org/drawingml/2006/main" noChangeAspect="1"/>
             </wp:cNvGraphicFramePr>
@@ -41,7 +41,7 @@
               <a:graphicData uri="http://schemas.openxmlformats.org/drawingml/2006/picture">
                 <pic:pic xmlns:pic="http://schemas.openxmlformats.org/drawingml/2006/picture">
                   <pic:nvPicPr>
-                    <pic:cNvPr id="1336374092" name=""/>
+                    <pic:cNvPr id="1966470041" name=""/>
                     <pic:cNvPicPr/>
                   </pic:nvPicPr>
                   <pic:blipFill>
@@ -59,7 +59,7 @@
                   <pic:spPr>
                     <a:xfrm>
                       <a:off x="0" y="0"/>
-                      <a:ext cx="7761605" cy="693420"/>
+                      <a:ext cx="7639685" cy="830580"/>
                     </a:xfrm>
                     <a:prstGeom prst="rect">
                       <a:avLst/>
@@ -91,7 +91,6 @@
     <w:p>
       <w:pPr>
         <w:rPr>
-          <w:rFonts w:hint="cs"/>
           <w:rtl/>
         </w:rPr>
       </w:pPr>

</xml_diff>